<commit_message>
Organize script files under Script folder
</commit_message>
<xml_diff>
--- a/Documents/ENDING.docx
+++ b/Documents/ENDING.docx
@@ -390,6 +390,7 @@
     </w:p>
     <w:p>
       <w:pPr>
+        <w:jc w:val="both"/>
         <w:rPr>
           <w:lang w:val="en-US"/>
         </w:rPr>
@@ -408,13 +409,12 @@
         </w:rPr>
         <w:t>is a top-down survival farming game set during a zombie apocalypse.</w:t>
       </w:r>
-    </w:p>
-    <w:p>
-      <w:pPr>
-        <w:rPr>
-          <w:lang w:val="en-US"/>
-        </w:rPr>
-      </w:pPr>
+      <w:r>
+        <w:rPr>
+          <w:lang w:val="en-US"/>
+        </w:rPr>
+        <w:t xml:space="preserve"> </w:t>
+      </w:r>
       <w:r>
         <w:rPr>
           <w:lang w:val="en-US"/>
@@ -431,15 +431,14 @@
         <w:rPr>
           <w:lang w:val="en-US"/>
         </w:rPr>
-        <w:t>defense.</w:t>
-      </w:r>
-    </w:p>
-    <w:p>
-      <w:pPr>
-        <w:rPr>
-          <w:lang w:val="en-US"/>
-        </w:rPr>
-      </w:pPr>
+        <w:t>defense</w:t>
+      </w:r>
+      <w:r>
+        <w:rPr>
+          <w:lang w:val="en-US"/>
+        </w:rPr>
+        <w:t xml:space="preserve">. </w:t>
+      </w:r>
       <w:r>
         <w:rPr>
           <w:lang w:val="en-US"/>
@@ -458,13 +457,12 @@
         </w:rPr>
         <w:t>not guns.</w:t>
       </w:r>
-    </w:p>
-    <w:p>
-      <w:pPr>
-        <w:rPr>
-          <w:lang w:val="en-US"/>
-        </w:rPr>
-      </w:pPr>
+      <w:r>
+        <w:rPr>
+          <w:lang w:val="en-US"/>
+        </w:rPr>
+        <w:t xml:space="preserve"> </w:t>
+      </w:r>
       <w:r>
         <w:rPr>
           <w:lang w:val="en-US"/>
@@ -600,43 +598,43 @@
         <w:rPr>
           <w:lang w:val="en-US"/>
         </w:rPr>
+        <w:t>Coins</w:t>
+      </w:r>
+    </w:p>
+    <w:p>
+      <w:pPr>
+        <w:pStyle w:val="ListParagraph"/>
+        <w:numPr>
+          <w:ilvl w:val="0"/>
+          <w:numId w:val="9"/>
+        </w:numPr>
+        <w:rPr>
+          <w:lang w:val="en-US"/>
+        </w:rPr>
+      </w:pPr>
+      <w:r>
+        <w:rPr>
+          <w:lang w:val="en-US"/>
+        </w:rPr>
+        <w:t>Equipment</w:t>
+      </w:r>
+    </w:p>
+    <w:p>
+      <w:pPr>
+        <w:pStyle w:val="ListParagraph"/>
+        <w:numPr>
+          <w:ilvl w:val="0"/>
+          <w:numId w:val="9"/>
+        </w:numPr>
+        <w:rPr>
+          <w:lang w:val="en-US"/>
+        </w:rPr>
+      </w:pPr>
+      <w:r>
+        <w:rPr>
+          <w:lang w:val="en-US"/>
+        </w:rPr>
         <w:lastRenderedPageBreak/>
-        <w:t>Coins</w:t>
-      </w:r>
-    </w:p>
-    <w:p>
-      <w:pPr>
-        <w:pStyle w:val="ListParagraph"/>
-        <w:numPr>
-          <w:ilvl w:val="0"/>
-          <w:numId w:val="9"/>
-        </w:numPr>
-        <w:rPr>
-          <w:lang w:val="en-US"/>
-        </w:rPr>
-      </w:pPr>
-      <w:r>
-        <w:rPr>
-          <w:lang w:val="en-US"/>
-        </w:rPr>
-        <w:t>Equipment</w:t>
-      </w:r>
-    </w:p>
-    <w:p>
-      <w:pPr>
-        <w:pStyle w:val="ListParagraph"/>
-        <w:numPr>
-          <w:ilvl w:val="0"/>
-          <w:numId w:val="9"/>
-        </w:numPr>
-        <w:rPr>
-          <w:lang w:val="en-US"/>
-        </w:rPr>
-      </w:pPr>
-      <w:r>
-        <w:rPr>
-          <w:lang w:val="en-US"/>
-        </w:rPr>
         <w:t>Preparation</w:t>
       </w:r>
     </w:p>
@@ -1043,24 +1041,24 @@
           <w:bCs/>
           <w:lang w:val="en-US"/>
         </w:rPr>
+        <w:t>04. CORE GAMEPLAY LOOP</w:t>
+      </w:r>
+    </w:p>
+    <w:p>
+      <w:pPr>
+        <w:rPr>
+          <w:b/>
+          <w:bCs/>
+          <w:lang w:val="en-US"/>
+        </w:rPr>
+      </w:pPr>
+      <w:r>
+        <w:rPr>
+          <w:b/>
+          <w:bCs/>
+          <w:lang w:val="en-US"/>
+        </w:rPr>
         <w:lastRenderedPageBreak/>
-        <w:t>04. CORE GAMEPLAY LOOP</w:t>
-      </w:r>
-    </w:p>
-    <w:p>
-      <w:pPr>
-        <w:rPr>
-          <w:b/>
-          <w:bCs/>
-          <w:lang w:val="en-US"/>
-        </w:rPr>
-      </w:pPr>
-      <w:r>
-        <w:rPr>
-          <w:b/>
-          <w:bCs/>
-          <w:lang w:val="en-US"/>
-        </w:rPr>
         <w:t>DAY</w:t>
       </w:r>
       <w:r>
@@ -1860,25 +1858,25 @@
         <w:rPr>
           <w:lang w:val="en-US"/>
         </w:rPr>
+        <w:t>Water Plants</w:t>
+      </w:r>
+    </w:p>
+    <w:p>
+      <w:pPr>
+        <w:pStyle w:val="ListParagraph"/>
+        <w:numPr>
+          <w:ilvl w:val="0"/>
+          <w:numId w:val="13"/>
+        </w:numPr>
+        <w:rPr>
+          <w:lang w:val="en-US"/>
+        </w:rPr>
+      </w:pPr>
+      <w:r>
+        <w:rPr>
+          <w:lang w:val="en-US"/>
+        </w:rPr>
         <w:lastRenderedPageBreak/>
-        <w:t>Water Plants</w:t>
-      </w:r>
-    </w:p>
-    <w:p>
-      <w:pPr>
-        <w:pStyle w:val="ListParagraph"/>
-        <w:numPr>
-          <w:ilvl w:val="0"/>
-          <w:numId w:val="13"/>
-        </w:numPr>
-        <w:rPr>
-          <w:lang w:val="en-US"/>
-        </w:rPr>
-      </w:pPr>
-      <w:r>
-        <w:rPr>
-          <w:lang w:val="en-US"/>
-        </w:rPr>
         <w:t>Buy Items</w:t>
       </w:r>
     </w:p>
@@ -2499,25 +2497,25 @@
         <w:rPr>
           <w:lang w:val="en-US"/>
         </w:rPr>
+        <w:t>FUTURE</w:t>
+      </w:r>
+    </w:p>
+    <w:p>
+      <w:pPr>
+        <w:pStyle w:val="ListParagraph"/>
+        <w:numPr>
+          <w:ilvl w:val="0"/>
+          <w:numId w:val="17"/>
+        </w:numPr>
+        <w:rPr>
+          <w:lang w:val="en-US"/>
+        </w:rPr>
+      </w:pPr>
+      <w:r>
+        <w:rPr>
+          <w:lang w:val="en-US"/>
+        </w:rPr>
         <w:lastRenderedPageBreak/>
-        <w:t>FUTURE</w:t>
-      </w:r>
-    </w:p>
-    <w:p>
-      <w:pPr>
-        <w:pStyle w:val="ListParagraph"/>
-        <w:numPr>
-          <w:ilvl w:val="0"/>
-          <w:numId w:val="17"/>
-        </w:numPr>
-        <w:rPr>
-          <w:lang w:val="en-US"/>
-        </w:rPr>
-      </w:pPr>
-      <w:r>
-        <w:rPr>
-          <w:lang w:val="en-US"/>
-        </w:rPr>
         <w:t>Storage</w:t>
       </w:r>
     </w:p>
@@ -3174,25 +3172,25 @@
         <w:rPr>
           <w:lang w:val="en-US"/>
         </w:rPr>
+        <w:t>Become Weak</w:t>
+      </w:r>
+    </w:p>
+    <w:p>
+      <w:pPr>
+        <w:pStyle w:val="ListParagraph"/>
+        <w:numPr>
+          <w:ilvl w:val="0"/>
+          <w:numId w:val="19"/>
+        </w:numPr>
+        <w:rPr>
+          <w:lang w:val="en-US"/>
+        </w:rPr>
+      </w:pPr>
+      <w:r>
+        <w:rPr>
+          <w:lang w:val="en-US"/>
+        </w:rPr>
         <w:lastRenderedPageBreak/>
-        <w:t>Become Weak</w:t>
-      </w:r>
-    </w:p>
-    <w:p>
-      <w:pPr>
-        <w:pStyle w:val="ListParagraph"/>
-        <w:numPr>
-          <w:ilvl w:val="0"/>
-          <w:numId w:val="19"/>
-        </w:numPr>
-        <w:rPr>
-          <w:lang w:val="en-US"/>
-        </w:rPr>
-      </w:pPr>
-      <w:r>
-        <w:rPr>
-          <w:lang w:val="en-US"/>
-        </w:rPr>
         <w:t>Die</w:t>
       </w:r>
     </w:p>
@@ -3827,20 +3825,20 @@
           <w:bCs/>
           <w:lang w:val="en-US"/>
         </w:rPr>
+        <w:t>13. ZOMBIES</w:t>
+      </w:r>
+    </w:p>
+    <w:p>
+      <w:pPr>
+        <w:rPr>
+          <w:lang w:val="en-US"/>
+        </w:rPr>
+      </w:pPr>
+      <w:r>
+        <w:rPr>
+          <w:lang w:val="en-US"/>
+        </w:rPr>
         <w:lastRenderedPageBreak/>
-        <w:t>13. ZOMBIES</w:t>
-      </w:r>
-    </w:p>
-    <w:p>
-      <w:pPr>
-        <w:rPr>
-          <w:lang w:val="en-US"/>
-        </w:rPr>
-      </w:pPr>
-      <w:r>
-        <w:rPr>
-          <w:lang w:val="en-US"/>
-        </w:rPr>
         <w:t>Zombies are the primary enemy.</w:t>
       </w:r>
       <w:r>
@@ -4304,20 +4302,20 @@
           <w:bCs/>
           <w:lang w:val="en-US"/>
         </w:rPr>
+        <w:t>Example:</w:t>
+      </w:r>
+    </w:p>
+    <w:p>
+      <w:pPr>
+        <w:rPr>
+          <w:lang w:val="en-US"/>
+        </w:rPr>
+      </w:pPr>
+      <w:r>
+        <w:rPr>
+          <w:lang w:val="en-US"/>
+        </w:rPr>
         <w:lastRenderedPageBreak/>
-        <w:t>Example:</w:t>
-      </w:r>
-    </w:p>
-    <w:p>
-      <w:pPr>
-        <w:rPr>
-          <w:lang w:val="en-US"/>
-        </w:rPr>
-      </w:pPr>
-      <w:r>
-        <w:rPr>
-          <w:lang w:val="en-US"/>
-        </w:rPr>
         <w:t>Zombie approaches</w:t>
       </w:r>
       <w:r>
@@ -5016,20 +5014,20 @@
           <w:bCs/>
           <w:lang w:val="en-US"/>
         </w:rPr>
+        <w:t>NIGHT</w:t>
+      </w:r>
+    </w:p>
+    <w:p>
+      <w:pPr>
+        <w:rPr>
+          <w:lang w:val="en-US"/>
+        </w:rPr>
+      </w:pPr>
+      <w:r>
+        <w:rPr>
+          <w:lang w:val="en-US"/>
+        </w:rPr>
         <w:lastRenderedPageBreak/>
-        <w:t>NIGHT</w:t>
-      </w:r>
-    </w:p>
-    <w:p>
-      <w:pPr>
-        <w:rPr>
-          <w:lang w:val="en-US"/>
-        </w:rPr>
-      </w:pPr>
-      <w:r>
-        <w:rPr>
-          <w:lang w:val="en-US"/>
-        </w:rPr>
         <w:t>Zombie attack period.</w:t>
       </w:r>
     </w:p>
@@ -5472,24 +5470,24 @@
           <w:bCs/>
           <w:lang w:val="en-US"/>
         </w:rPr>
+        <w:t>19. ECONOMY</w:t>
+      </w:r>
+    </w:p>
+    <w:p>
+      <w:pPr>
+        <w:rPr>
+          <w:b/>
+          <w:bCs/>
+          <w:lang w:val="en-US"/>
+        </w:rPr>
+      </w:pPr>
+      <w:r>
+        <w:rPr>
+          <w:b/>
+          <w:bCs/>
+          <w:lang w:val="en-US"/>
+        </w:rPr>
         <w:lastRenderedPageBreak/>
-        <w:t>19. ECONOMY</w:t>
-      </w:r>
-    </w:p>
-    <w:p>
-      <w:pPr>
-        <w:rPr>
-          <w:b/>
-          <w:bCs/>
-          <w:lang w:val="en-US"/>
-        </w:rPr>
-      </w:pPr>
-      <w:r>
-        <w:rPr>
-          <w:b/>
-          <w:bCs/>
-          <w:lang w:val="en-US"/>
-        </w:rPr>
         <w:t>Zombie dies</w:t>
       </w:r>
       <w:r>
@@ -6027,25 +6025,25 @@
         <w:rPr>
           <w:lang w:val="en-US"/>
         </w:rPr>
+        <w:t>Bosses</w:t>
+      </w:r>
+    </w:p>
+    <w:p>
+      <w:pPr>
+        <w:pStyle w:val="ListParagraph"/>
+        <w:numPr>
+          <w:ilvl w:val="0"/>
+          <w:numId w:val="29"/>
+        </w:numPr>
+        <w:rPr>
+          <w:lang w:val="en-US"/>
+        </w:rPr>
+      </w:pPr>
+      <w:r>
+        <w:rPr>
+          <w:lang w:val="en-US"/>
+        </w:rPr>
         <w:lastRenderedPageBreak/>
-        <w:t>Bosses</w:t>
-      </w:r>
-    </w:p>
-    <w:p>
-      <w:pPr>
-        <w:pStyle w:val="ListParagraph"/>
-        <w:numPr>
-          <w:ilvl w:val="0"/>
-          <w:numId w:val="29"/>
-        </w:numPr>
-        <w:rPr>
-          <w:lang w:val="en-US"/>
-        </w:rPr>
-      </w:pPr>
-      <w:r>
-        <w:rPr>
-          <w:lang w:val="en-US"/>
-        </w:rPr>
         <w:t>Weather</w:t>
       </w:r>
     </w:p>
@@ -6148,6 +6146,12 @@
         </w:rPr>
         <w:t>Movement</w:t>
       </w:r>
+      <w:r>
+        <w:rPr>
+          <w:lang w:val="en-US"/>
+        </w:rPr>
+        <w:t xml:space="preserve"> - done</w:t>
+      </w:r>
     </w:p>
     <w:p>
       <w:pPr>
@@ -6166,6 +6170,12 @@
         </w:rPr>
         <w:t>Mouse Aim</w:t>
       </w:r>
+      <w:r>
+        <w:rPr>
+          <w:lang w:val="en-US"/>
+        </w:rPr>
+        <w:t xml:space="preserve"> - done</w:t>
+      </w:r>
     </w:p>
     <w:p>
       <w:pPr>
@@ -6184,6 +6194,12 @@
         </w:rPr>
         <w:t>Shooting</w:t>
       </w:r>
+      <w:r>
+        <w:rPr>
+          <w:lang w:val="en-US"/>
+        </w:rPr>
+        <w:t xml:space="preserve"> - done</w:t>
+      </w:r>
     </w:p>
     <w:p>
       <w:pPr>
@@ -6200,7 +6216,13 @@
         <w:rPr>
           <w:lang w:val="en-US"/>
         </w:rPr>
-        <w:t>Reload</w:t>
+        <w:t>Reloa</w:t>
+      </w:r>
+      <w:r>
+        <w:rPr>
+          <w:lang w:val="en-US"/>
+        </w:rPr>
+        <w:t>d - done</w:t>
       </w:r>
     </w:p>
     <w:p>
@@ -6220,6 +6242,12 @@
         </w:rPr>
         <w:t>Health</w:t>
       </w:r>
+      <w:r>
+        <w:rPr>
+          <w:lang w:val="en-US"/>
+        </w:rPr>
+        <w:t xml:space="preserve"> - done</w:t>
+      </w:r>
     </w:p>
     <w:p>
       <w:pPr>
@@ -6237,6 +6265,12 @@
           <w:lang w:val="en-US"/>
         </w:rPr>
         <w:t>Death</w:t>
+      </w:r>
+      <w:r>
+        <w:rPr>
+          <w:lang w:val="en-US"/>
+        </w:rPr>
+        <w:t xml:space="preserve"> - done</w:t>
       </w:r>
     </w:p>
     <w:p>

</xml_diff>